<commit_message>
Remove VPC flow logs: drop FlowLogBucket + VpcFlowLog from template and all deliverables
- Template: delete S3 bucket and flow log resources, keep template lint-clean
- README: drop flow-log rows/bullets, cfn-guard findings now 9 (was 14)
- Deliverables: remove flow-log chips/bullets/rows from PPTX, EXCEL, DOCX
- Doc generator regenerated
</commit_message>
<xml_diff>
--- a/deliverables/Backup-MSSQL-EC2-Recovery-and-VPN-Configuration.docx
+++ b/deliverables/Backup-MSSQL-EC2-Recovery-and-VPN-Configuration.docx
@@ -576,7 +576,7 @@
                 <w:b/>
                 <w:sz w:val="20"/>
               </w:rPr>
-              <w:t>Flow logs</w:t>
+              <w:t>Client VPN logs</w:t>
             </w:r>
           </w:p>
         </w:tc>
@@ -600,63 +600,6 @@
         <w:tc>
           <w:tcPr>
             <w:tcW w:type="dxa" w:w="6048"/>
-          </w:tcPr>
-          <w:p>
-            <w:pPr>
-              <w:spacing w:before="20" w:after="20"/>
-            </w:pPr>
-            <w:r/>
-            <w:r>
-              <w:rPr>
-                <w:sz w:val="20"/>
-              </w:rPr>
-              <w:t>VPC flow logs → S3; lifecycle 30d → Glacier, expire 365d</w:t>
-            </w:r>
-          </w:p>
-        </w:tc>
-      </w:tr>
-      <w:tr>
-        <w:tc>
-          <w:tcPr>
-            <w:tcW w:type="dxa" w:w="2160"/>
-            <w:shd w:val="clear" w:fill="F2F7FB"/>
-          </w:tcPr>
-          <w:p>
-            <w:pPr>
-              <w:spacing w:before="20" w:after="20"/>
-            </w:pPr>
-            <w:r/>
-            <w:r>
-              <w:rPr>
-                <w:b/>
-                <w:sz w:val="20"/>
-              </w:rPr>
-              <w:t>Client VPN logs</w:t>
-            </w:r>
-          </w:p>
-        </w:tc>
-        <w:tc>
-          <w:tcPr>
-            <w:tcW w:type="dxa" w:w="2592"/>
-            <w:shd w:val="clear" w:fill="F2F7FB"/>
-          </w:tcPr>
-          <w:p>
-            <w:pPr>
-              <w:spacing w:before="20" w:after="20"/>
-            </w:pPr>
-            <w:r/>
-            <w:r>
-              <w:rPr>
-                <w:sz w:val="20"/>
-              </w:rPr>
-              <w:t>AWS (automatic)</w:t>
-            </w:r>
-          </w:p>
-        </w:tc>
-        <w:tc>
-          <w:tcPr>
-            <w:tcW w:type="dxa" w:w="6048"/>
-            <w:shd w:val="clear" w:fill="F2F7FB"/>
           </w:tcPr>
           <w:p>
             <w:pPr>

</xml_diff>